<commit_message>
v. 2.2.2 new logo
</commit_message>
<xml_diff>
--- a/src/word/reference.docx
+++ b/src/word/reference.docx
@@ -166,15 +166,7 @@
               <w:pStyle w:val="Compact"/>
             </w:pPr>
             <w:r>
-              <w:t xml:space="preserve">Another </w:t>
-            </w:r>
-            <w:proofErr w:type="gramStart"/>
-            <w:r>
-              <w:t>version</w:t>
-            </w:r>
-            <w:proofErr w:type="gramEnd"/>
-            <w:r>
-              <w:t xml:space="preserve"> for example</w:t>
+              <w:t>Another version for example</w:t>
             </w:r>
           </w:p>
         </w:tc>
@@ -488,13 +480,8 @@
       <w:pPr>
         <w:pStyle w:val="Definition"/>
       </w:pPr>
-      <w:proofErr w:type="gramStart"/>
-      <w:r>
-        <w:t>Did not apply</w:t>
-      </w:r>
-      <w:proofErr w:type="gramEnd"/>
-      <w:r>
-        <w:t xml:space="preserve"> for any funding yet.</w:t>
+      <w:r>
+        <w:t>Did not apply for any funding yet.</w:t>
       </w:r>
     </w:p>
     <w:p>
@@ -502,535 +489,7 @@
         <w:pStyle w:val="FirstParagraph"/>
       </w:pPr>
       <w:r>
-        <w:t xml:space="preserve">Lorem ipsum dolor </w:t>
-      </w:r>
-      <w:proofErr w:type="gramStart"/>
-      <w:r>
-        <w:t>sit</w:t>
-      </w:r>
-      <w:proofErr w:type="gramEnd"/>
-      <w:r>
-        <w:t xml:space="preserve"> </w:t>
-      </w:r>
-      <w:proofErr w:type="spellStart"/>
-      <w:r>
-        <w:t>amet</w:t>
-      </w:r>
-      <w:proofErr w:type="spellEnd"/>
-      <w:r>
-        <w:t xml:space="preserve">, </w:t>
-      </w:r>
-      <w:proofErr w:type="spellStart"/>
-      <w:r>
-        <w:t>consectetur</w:t>
-      </w:r>
-      <w:proofErr w:type="spellEnd"/>
-      <w:r>
-        <w:t xml:space="preserve"> </w:t>
-      </w:r>
-      <w:proofErr w:type="spellStart"/>
-      <w:r>
-        <w:t>adipiscing</w:t>
-      </w:r>
-      <w:proofErr w:type="spellEnd"/>
-      <w:r>
-        <w:t xml:space="preserve"> </w:t>
-      </w:r>
-      <w:proofErr w:type="spellStart"/>
-      <w:r>
-        <w:t>elit</w:t>
-      </w:r>
-      <w:proofErr w:type="spellEnd"/>
-      <w:r>
-        <w:t xml:space="preserve">. </w:t>
-      </w:r>
-      <w:proofErr w:type="spellStart"/>
-      <w:r>
-        <w:t>Etiam</w:t>
-      </w:r>
-      <w:proofErr w:type="spellEnd"/>
-      <w:r>
-        <w:t xml:space="preserve"> ac </w:t>
-      </w:r>
-      <w:proofErr w:type="spellStart"/>
-      <w:r>
-        <w:t>sollicitudin</w:t>
-      </w:r>
-      <w:proofErr w:type="spellEnd"/>
-      <w:r>
-        <w:t xml:space="preserve"> </w:t>
-      </w:r>
-      <w:proofErr w:type="spellStart"/>
-      <w:r>
-        <w:t>mauris</w:t>
-      </w:r>
-      <w:proofErr w:type="spellEnd"/>
-      <w:r>
-        <w:t xml:space="preserve">. Lorem ipsum dolor </w:t>
-      </w:r>
-      <w:proofErr w:type="gramStart"/>
-      <w:r>
-        <w:t>sit</w:t>
-      </w:r>
-      <w:proofErr w:type="gramEnd"/>
-      <w:r>
-        <w:t xml:space="preserve"> </w:t>
-      </w:r>
-      <w:proofErr w:type="spellStart"/>
-      <w:r>
-        <w:t>amet</w:t>
-      </w:r>
-      <w:proofErr w:type="spellEnd"/>
-      <w:r>
-        <w:t xml:space="preserve">, </w:t>
-      </w:r>
-      <w:proofErr w:type="spellStart"/>
-      <w:r>
-        <w:t>consectetur</w:t>
-      </w:r>
-      <w:proofErr w:type="spellEnd"/>
-      <w:r>
-        <w:t xml:space="preserve"> </w:t>
-      </w:r>
-      <w:proofErr w:type="spellStart"/>
-      <w:r>
-        <w:t>adipiscing</w:t>
-      </w:r>
-      <w:proofErr w:type="spellEnd"/>
-      <w:r>
-        <w:t xml:space="preserve"> </w:t>
-      </w:r>
-      <w:proofErr w:type="spellStart"/>
-      <w:r>
-        <w:t>elit</w:t>
-      </w:r>
-      <w:proofErr w:type="spellEnd"/>
-      <w:r>
-        <w:t xml:space="preserve">. Nam </w:t>
-      </w:r>
-      <w:proofErr w:type="spellStart"/>
-      <w:r>
-        <w:t>ut</w:t>
-      </w:r>
-      <w:proofErr w:type="spellEnd"/>
-      <w:r>
-        <w:t xml:space="preserve"> </w:t>
-      </w:r>
-      <w:proofErr w:type="spellStart"/>
-      <w:r>
-        <w:t>pellentesque</w:t>
-      </w:r>
-      <w:proofErr w:type="spellEnd"/>
-      <w:r>
-        <w:t xml:space="preserve"> </w:t>
-      </w:r>
-      <w:proofErr w:type="spellStart"/>
-      <w:r>
-        <w:t>tellus</w:t>
-      </w:r>
-      <w:proofErr w:type="spellEnd"/>
-      <w:r>
-        <w:t xml:space="preserve">, </w:t>
-      </w:r>
-      <w:proofErr w:type="spellStart"/>
-      <w:r>
-        <w:t>quis</w:t>
-      </w:r>
-      <w:proofErr w:type="spellEnd"/>
-      <w:r>
-        <w:t xml:space="preserve"> </w:t>
-      </w:r>
-      <w:proofErr w:type="spellStart"/>
-      <w:r>
-        <w:t>imperdiet</w:t>
-      </w:r>
-      <w:proofErr w:type="spellEnd"/>
-      <w:r>
-        <w:t xml:space="preserve"> </w:t>
-      </w:r>
-      <w:proofErr w:type="spellStart"/>
-      <w:r>
-        <w:t>erat</w:t>
-      </w:r>
-      <w:proofErr w:type="spellEnd"/>
-      <w:r>
-        <w:t xml:space="preserve">. </w:t>
-      </w:r>
-      <w:proofErr w:type="spellStart"/>
-      <w:r>
-        <w:t>Vivamus</w:t>
-      </w:r>
-      <w:proofErr w:type="spellEnd"/>
-      <w:r>
-        <w:t xml:space="preserve"> ac cursus </w:t>
-      </w:r>
-      <w:proofErr w:type="spellStart"/>
-      <w:r>
-        <w:t>metus</w:t>
-      </w:r>
-      <w:proofErr w:type="spellEnd"/>
-      <w:r>
-        <w:t xml:space="preserve">. Donec </w:t>
-      </w:r>
-      <w:proofErr w:type="spellStart"/>
-      <w:r>
-        <w:t>accumsan</w:t>
-      </w:r>
-      <w:proofErr w:type="spellEnd"/>
-      <w:r>
-        <w:t xml:space="preserve"> </w:t>
-      </w:r>
-      <w:proofErr w:type="spellStart"/>
-      <w:r>
-        <w:t>nibh</w:t>
-      </w:r>
-      <w:proofErr w:type="spellEnd"/>
-      <w:r>
-        <w:t xml:space="preserve"> </w:t>
-      </w:r>
-      <w:proofErr w:type="spellStart"/>
-      <w:r>
-        <w:t>tempor</w:t>
-      </w:r>
-      <w:proofErr w:type="spellEnd"/>
-      <w:r>
-        <w:t xml:space="preserve"> </w:t>
-      </w:r>
-      <w:proofErr w:type="spellStart"/>
-      <w:r>
-        <w:t>erat</w:t>
-      </w:r>
-      <w:proofErr w:type="spellEnd"/>
-      <w:r>
-        <w:t xml:space="preserve"> </w:t>
-      </w:r>
-      <w:proofErr w:type="spellStart"/>
-      <w:r>
-        <w:t>blandit</w:t>
-      </w:r>
-      <w:proofErr w:type="spellEnd"/>
-      <w:r>
-        <w:t xml:space="preserve">, </w:t>
-      </w:r>
-      <w:proofErr w:type="spellStart"/>
-      <w:r>
-        <w:t>eget</w:t>
-      </w:r>
-      <w:proofErr w:type="spellEnd"/>
-      <w:r>
-        <w:t xml:space="preserve"> </w:t>
-      </w:r>
-      <w:proofErr w:type="spellStart"/>
-      <w:r>
-        <w:t>tincidunt</w:t>
-      </w:r>
-      <w:proofErr w:type="spellEnd"/>
-      <w:r>
-        <w:t xml:space="preserve"> </w:t>
-      </w:r>
-      <w:proofErr w:type="spellStart"/>
-      <w:r>
-        <w:t>tellus</w:t>
-      </w:r>
-      <w:proofErr w:type="spellEnd"/>
-      <w:r>
-        <w:t xml:space="preserve"> </w:t>
-      </w:r>
-      <w:proofErr w:type="spellStart"/>
-      <w:r>
-        <w:t>aliquet</w:t>
-      </w:r>
-      <w:proofErr w:type="spellEnd"/>
-      <w:r>
-        <w:t xml:space="preserve">. Sed </w:t>
-      </w:r>
-      <w:proofErr w:type="spellStart"/>
-      <w:r>
-        <w:t>iaculis</w:t>
-      </w:r>
-      <w:proofErr w:type="spellEnd"/>
-      <w:r>
-        <w:t xml:space="preserve"> pharetra </w:t>
-      </w:r>
-      <w:proofErr w:type="spellStart"/>
-      <w:r>
-        <w:t>sapien</w:t>
-      </w:r>
-      <w:proofErr w:type="spellEnd"/>
-      <w:r>
-        <w:t xml:space="preserve">, sed </w:t>
-      </w:r>
-      <w:proofErr w:type="spellStart"/>
-      <w:r>
-        <w:t>aliquet</w:t>
-      </w:r>
-      <w:proofErr w:type="spellEnd"/>
-      <w:r>
-        <w:t xml:space="preserve"> nunc </w:t>
-      </w:r>
-      <w:proofErr w:type="spellStart"/>
-      <w:r>
-        <w:t>blandit</w:t>
-      </w:r>
-      <w:proofErr w:type="spellEnd"/>
-      <w:r>
-        <w:t xml:space="preserve"> at. Maecenas </w:t>
-      </w:r>
-      <w:proofErr w:type="spellStart"/>
-      <w:r>
-        <w:t>rutrum</w:t>
-      </w:r>
-      <w:proofErr w:type="spellEnd"/>
-      <w:r>
-        <w:t xml:space="preserve"> </w:t>
-      </w:r>
-      <w:proofErr w:type="spellStart"/>
-      <w:r>
-        <w:t>accumsan</w:t>
-      </w:r>
-      <w:proofErr w:type="spellEnd"/>
-      <w:r>
-        <w:t xml:space="preserve"> </w:t>
-      </w:r>
-      <w:proofErr w:type="spellStart"/>
-      <w:r>
-        <w:t>congue</w:t>
-      </w:r>
-      <w:proofErr w:type="spellEnd"/>
-      <w:r>
-        <w:t xml:space="preserve">. </w:t>
-      </w:r>
-      <w:proofErr w:type="spellStart"/>
-      <w:r>
-        <w:t>Aliquam</w:t>
-      </w:r>
-      <w:proofErr w:type="spellEnd"/>
-      <w:r>
-        <w:t xml:space="preserve"> </w:t>
-      </w:r>
-      <w:proofErr w:type="spellStart"/>
-      <w:r>
-        <w:t>ultricies</w:t>
-      </w:r>
-      <w:proofErr w:type="spellEnd"/>
-      <w:r>
-        <w:t xml:space="preserve"> </w:t>
-      </w:r>
-      <w:proofErr w:type="spellStart"/>
-      <w:r>
-        <w:t>mattis</w:t>
-      </w:r>
-      <w:proofErr w:type="spellEnd"/>
-      <w:r>
-        <w:t xml:space="preserve"> </w:t>
-      </w:r>
-      <w:proofErr w:type="spellStart"/>
-      <w:r>
-        <w:t>leo</w:t>
-      </w:r>
-      <w:proofErr w:type="spellEnd"/>
-      <w:r>
-        <w:t xml:space="preserve"> a </w:t>
-      </w:r>
-      <w:proofErr w:type="spellStart"/>
-      <w:r>
-        <w:t>sagittis</w:t>
-      </w:r>
-      <w:proofErr w:type="spellEnd"/>
-      <w:r>
-        <w:t xml:space="preserve">. </w:t>
-      </w:r>
-      <w:proofErr w:type="spellStart"/>
-      <w:r>
-        <w:t>Interdum</w:t>
-      </w:r>
-      <w:proofErr w:type="spellEnd"/>
-      <w:r>
-        <w:t xml:space="preserve"> et </w:t>
-      </w:r>
-      <w:proofErr w:type="spellStart"/>
-      <w:r>
-        <w:t>malesuada</w:t>
-      </w:r>
-      <w:proofErr w:type="spellEnd"/>
-      <w:r>
-        <w:t xml:space="preserve"> fames ac ante ipsum </w:t>
-      </w:r>
-      <w:proofErr w:type="spellStart"/>
-      <w:r>
-        <w:t>primis</w:t>
-      </w:r>
-      <w:proofErr w:type="spellEnd"/>
-      <w:r>
-        <w:t xml:space="preserve"> in </w:t>
-      </w:r>
-      <w:proofErr w:type="spellStart"/>
-      <w:r>
-        <w:t>faucibus</w:t>
-      </w:r>
-      <w:proofErr w:type="spellEnd"/>
-      <w:r>
-        <w:t xml:space="preserve">. </w:t>
-      </w:r>
-      <w:proofErr w:type="spellStart"/>
-      <w:r>
-        <w:t>Nullam</w:t>
-      </w:r>
-      <w:proofErr w:type="spellEnd"/>
-      <w:r>
-        <w:t xml:space="preserve"> pharetra nisi sed dolor vestibulum </w:t>
-      </w:r>
-      <w:proofErr w:type="spellStart"/>
-      <w:r>
-        <w:t>mollis</w:t>
-      </w:r>
-      <w:proofErr w:type="spellEnd"/>
-      <w:r>
-        <w:t xml:space="preserve">. </w:t>
-      </w:r>
-      <w:proofErr w:type="spellStart"/>
-      <w:r>
-        <w:t>Suspendisse</w:t>
-      </w:r>
-      <w:proofErr w:type="spellEnd"/>
-      <w:r>
-        <w:t xml:space="preserve"> </w:t>
-      </w:r>
-      <w:proofErr w:type="spellStart"/>
-      <w:r>
-        <w:t>tristique</w:t>
-      </w:r>
-      <w:proofErr w:type="spellEnd"/>
-      <w:r>
-        <w:t xml:space="preserve"> nunc id </w:t>
-      </w:r>
-      <w:proofErr w:type="spellStart"/>
-      <w:r>
-        <w:t>venenatis</w:t>
-      </w:r>
-      <w:proofErr w:type="spellEnd"/>
-      <w:r>
-        <w:t xml:space="preserve"> </w:t>
-      </w:r>
-      <w:proofErr w:type="spellStart"/>
-      <w:r>
-        <w:t>sodales</w:t>
-      </w:r>
-      <w:proofErr w:type="spellEnd"/>
-      <w:r>
-        <w:t xml:space="preserve">. </w:t>
-      </w:r>
-      <w:proofErr w:type="spellStart"/>
-      <w:r>
-        <w:t>Nullam</w:t>
-      </w:r>
-      <w:proofErr w:type="spellEnd"/>
-      <w:r>
-        <w:t xml:space="preserve"> </w:t>
-      </w:r>
-      <w:proofErr w:type="spellStart"/>
-      <w:r>
-        <w:t>euismod</w:t>
-      </w:r>
-      <w:proofErr w:type="spellEnd"/>
-      <w:r>
-        <w:t xml:space="preserve"> </w:t>
-      </w:r>
-      <w:proofErr w:type="spellStart"/>
-      <w:r>
-        <w:t>lectus</w:t>
-      </w:r>
-      <w:proofErr w:type="spellEnd"/>
-      <w:r>
-        <w:t xml:space="preserve"> </w:t>
-      </w:r>
-      <w:proofErr w:type="spellStart"/>
-      <w:r>
-        <w:t>velit</w:t>
-      </w:r>
-      <w:proofErr w:type="spellEnd"/>
-      <w:r>
-        <w:t xml:space="preserve">, ac pharetra diam </w:t>
-      </w:r>
-      <w:proofErr w:type="spellStart"/>
-      <w:r>
-        <w:t>volutpat</w:t>
-      </w:r>
-      <w:proofErr w:type="spellEnd"/>
-      <w:r>
-        <w:t xml:space="preserve"> </w:t>
-      </w:r>
-      <w:proofErr w:type="spellStart"/>
-      <w:r>
-        <w:t>eu</w:t>
-      </w:r>
-      <w:proofErr w:type="spellEnd"/>
-      <w:r>
-        <w:t xml:space="preserve">. </w:t>
-      </w:r>
-      <w:proofErr w:type="spellStart"/>
-      <w:r>
-        <w:t>Suspendisse</w:t>
-      </w:r>
-      <w:proofErr w:type="spellEnd"/>
-      <w:r>
-        <w:t xml:space="preserve"> </w:t>
-      </w:r>
-      <w:proofErr w:type="spellStart"/>
-      <w:r>
-        <w:t>laoreet</w:t>
-      </w:r>
-      <w:proofErr w:type="spellEnd"/>
-      <w:r>
-        <w:t xml:space="preserve"> </w:t>
-      </w:r>
-      <w:proofErr w:type="spellStart"/>
-      <w:r>
-        <w:t>erat</w:t>
-      </w:r>
-      <w:proofErr w:type="spellEnd"/>
-      <w:r>
-        <w:t xml:space="preserve"> </w:t>
-      </w:r>
-      <w:proofErr w:type="spellStart"/>
-      <w:r>
-        <w:t>ut</w:t>
-      </w:r>
-      <w:proofErr w:type="spellEnd"/>
-      <w:r>
-        <w:t xml:space="preserve"> lorem </w:t>
-      </w:r>
-      <w:proofErr w:type="spellStart"/>
-      <w:r>
-        <w:t>mollis</w:t>
-      </w:r>
-      <w:proofErr w:type="spellEnd"/>
-      <w:r>
-        <w:t xml:space="preserve">, at </w:t>
-      </w:r>
-      <w:proofErr w:type="spellStart"/>
-      <w:r>
-        <w:t>ullamcorper</w:t>
-      </w:r>
-      <w:proofErr w:type="spellEnd"/>
-      <w:r>
-        <w:t xml:space="preserve"> </w:t>
-      </w:r>
-      <w:proofErr w:type="spellStart"/>
-      <w:r>
-        <w:t>velit</w:t>
-      </w:r>
-      <w:proofErr w:type="spellEnd"/>
-      <w:r>
-        <w:t xml:space="preserve"> </w:t>
-      </w:r>
-      <w:proofErr w:type="spellStart"/>
-      <w:r>
-        <w:t>vehicula</w:t>
-      </w:r>
-      <w:proofErr w:type="spellEnd"/>
-      <w:r>
-        <w:t>.</w:t>
+        <w:t>Lorem ipsum dolor sit amet, consectetur adipiscing elit. Etiam ac sollicitudin mauris. Lorem ipsum dolor sit amet, consectetur adipiscing elit. Nam ut pellentesque tellus, quis imperdiet erat. Vivamus ac cursus metus. Donec accumsan nibh tempor erat blandit, eget tincidunt tellus aliquet. Sed iaculis pharetra sapien, sed aliquet nunc blandit at. Maecenas rutrum accumsan congue. Aliquam ultricies mattis leo a sagittis. Interdum et malesuada fames ac ante ipsum primis in faucibus. Nullam pharetra nisi sed dolor vestibulum mollis. Suspendisse tristique nunc id venenatis sodales. Nullam euismod lectus velit, ac pharetra diam volutpat eu. Suspendisse laoreet erat ut lorem mollis, at ullamcorper velit vehicula.</w:t>
       </w:r>
     </w:p>
     <w:p>
@@ -1038,343 +497,7 @@
         <w:pStyle w:val="Zkladntext"/>
       </w:pPr>
       <w:r>
-        <w:t xml:space="preserve">In hac </w:t>
-      </w:r>
-      <w:proofErr w:type="spellStart"/>
-      <w:r>
-        <w:t>habitasse</w:t>
-      </w:r>
-      <w:proofErr w:type="spellEnd"/>
-      <w:r>
-        <w:t xml:space="preserve"> </w:t>
-      </w:r>
-      <w:proofErr w:type="spellStart"/>
-      <w:r>
-        <w:t>platea</w:t>
-      </w:r>
-      <w:proofErr w:type="spellEnd"/>
-      <w:r>
-        <w:t xml:space="preserve"> </w:t>
-      </w:r>
-      <w:proofErr w:type="spellStart"/>
-      <w:r>
-        <w:t>dictumst</w:t>
-      </w:r>
-      <w:proofErr w:type="spellEnd"/>
-      <w:r>
-        <w:t xml:space="preserve">. Donec in convallis </w:t>
-      </w:r>
-      <w:proofErr w:type="spellStart"/>
-      <w:r>
-        <w:t>enim</w:t>
-      </w:r>
-      <w:proofErr w:type="spellEnd"/>
-      <w:r>
-        <w:t xml:space="preserve">, id </w:t>
-      </w:r>
-      <w:proofErr w:type="spellStart"/>
-      <w:r>
-        <w:t>aliquam</w:t>
-      </w:r>
-      <w:proofErr w:type="spellEnd"/>
-      <w:r>
-        <w:t xml:space="preserve"> </w:t>
-      </w:r>
-      <w:proofErr w:type="spellStart"/>
-      <w:r>
-        <w:t>leo</w:t>
-      </w:r>
-      <w:proofErr w:type="spellEnd"/>
-      <w:r>
-        <w:t xml:space="preserve">. Nam non </w:t>
-      </w:r>
-      <w:proofErr w:type="spellStart"/>
-      <w:r>
-        <w:t>justo</w:t>
-      </w:r>
-      <w:proofErr w:type="spellEnd"/>
-      <w:r>
-        <w:t xml:space="preserve"> a magna </w:t>
-      </w:r>
-      <w:proofErr w:type="spellStart"/>
-      <w:r>
-        <w:t>aliquet</w:t>
-      </w:r>
-      <w:proofErr w:type="spellEnd"/>
-      <w:r>
-        <w:t xml:space="preserve"> </w:t>
-      </w:r>
-      <w:proofErr w:type="spellStart"/>
-      <w:r>
-        <w:t>blandit</w:t>
-      </w:r>
-      <w:proofErr w:type="spellEnd"/>
-      <w:r>
-        <w:t xml:space="preserve"> at </w:t>
-      </w:r>
-      <w:proofErr w:type="spellStart"/>
-      <w:r>
-        <w:t>interdum</w:t>
-      </w:r>
-      <w:proofErr w:type="spellEnd"/>
-      <w:r>
-        <w:t xml:space="preserve"> </w:t>
-      </w:r>
-      <w:proofErr w:type="spellStart"/>
-      <w:r>
-        <w:t>nulla</w:t>
-      </w:r>
-      <w:proofErr w:type="spellEnd"/>
-      <w:r>
-        <w:t xml:space="preserve">. Class </w:t>
-      </w:r>
-      <w:proofErr w:type="spellStart"/>
-      <w:r>
-        <w:t>aptent</w:t>
-      </w:r>
-      <w:proofErr w:type="spellEnd"/>
-      <w:r>
-        <w:t xml:space="preserve"> </w:t>
-      </w:r>
-      <w:proofErr w:type="spellStart"/>
-      <w:r>
-        <w:t>taciti</w:t>
-      </w:r>
-      <w:proofErr w:type="spellEnd"/>
-      <w:r>
-        <w:t xml:space="preserve"> </w:t>
-      </w:r>
-      <w:proofErr w:type="spellStart"/>
-      <w:r>
-        <w:t>sociosqu</w:t>
-      </w:r>
-      <w:proofErr w:type="spellEnd"/>
-      <w:r>
-        <w:t xml:space="preserve"> </w:t>
-      </w:r>
-      <w:proofErr w:type="spellStart"/>
-      <w:r>
-        <w:t>ad</w:t>
-      </w:r>
-      <w:proofErr w:type="spellEnd"/>
-      <w:r>
-        <w:t xml:space="preserve"> </w:t>
-      </w:r>
-      <w:proofErr w:type="spellStart"/>
-      <w:r>
-        <w:t>litora</w:t>
-      </w:r>
-      <w:proofErr w:type="spellEnd"/>
-      <w:r>
-        <w:t xml:space="preserve"> </w:t>
-      </w:r>
-      <w:proofErr w:type="spellStart"/>
-      <w:r>
-        <w:t>torquent</w:t>
-      </w:r>
-      <w:proofErr w:type="spellEnd"/>
-      <w:r>
-        <w:t xml:space="preserve"> per </w:t>
-      </w:r>
-      <w:proofErr w:type="spellStart"/>
-      <w:r>
-        <w:t>conubia</w:t>
-      </w:r>
-      <w:proofErr w:type="spellEnd"/>
-      <w:r>
-        <w:t xml:space="preserve"> nostra, per </w:t>
-      </w:r>
-      <w:proofErr w:type="spellStart"/>
-      <w:r>
-        <w:t>inceptos</w:t>
-      </w:r>
-      <w:proofErr w:type="spellEnd"/>
-      <w:r>
-        <w:t xml:space="preserve"> </w:t>
-      </w:r>
-      <w:proofErr w:type="spellStart"/>
-      <w:r>
-        <w:t>himenaeos</w:t>
-      </w:r>
-      <w:proofErr w:type="spellEnd"/>
-      <w:r>
-        <w:t xml:space="preserve">. Donec </w:t>
-      </w:r>
-      <w:proofErr w:type="spellStart"/>
-      <w:r>
-        <w:t>condimentum</w:t>
-      </w:r>
-      <w:proofErr w:type="spellEnd"/>
-      <w:r>
-        <w:t xml:space="preserve"> non dolor </w:t>
-      </w:r>
-      <w:proofErr w:type="spellStart"/>
-      <w:r>
-        <w:t>quis</w:t>
-      </w:r>
-      <w:proofErr w:type="spellEnd"/>
-      <w:r>
-        <w:t xml:space="preserve"> </w:t>
-      </w:r>
-      <w:proofErr w:type="spellStart"/>
-      <w:r>
-        <w:t>suscipit</w:t>
-      </w:r>
-      <w:proofErr w:type="spellEnd"/>
-      <w:r>
-        <w:t xml:space="preserve">. Nam </w:t>
-      </w:r>
-      <w:proofErr w:type="spellStart"/>
-      <w:r>
-        <w:t>ut</w:t>
-      </w:r>
-      <w:proofErr w:type="spellEnd"/>
-      <w:r>
-        <w:t xml:space="preserve"> </w:t>
-      </w:r>
-      <w:proofErr w:type="spellStart"/>
-      <w:r>
-        <w:t>sem</w:t>
-      </w:r>
-      <w:proofErr w:type="spellEnd"/>
-      <w:r>
-        <w:t xml:space="preserve"> </w:t>
-      </w:r>
-      <w:proofErr w:type="spellStart"/>
-      <w:r>
-        <w:t>ut</w:t>
-      </w:r>
-      <w:proofErr w:type="spellEnd"/>
-      <w:r>
-        <w:t xml:space="preserve"> </w:t>
-      </w:r>
-      <w:proofErr w:type="spellStart"/>
-      <w:r>
-        <w:t>neque</w:t>
-      </w:r>
-      <w:proofErr w:type="spellEnd"/>
-      <w:r>
-        <w:t xml:space="preserve"> </w:t>
-      </w:r>
-      <w:proofErr w:type="spellStart"/>
-      <w:r>
-        <w:t>efficitur</w:t>
-      </w:r>
-      <w:proofErr w:type="spellEnd"/>
-      <w:r>
-        <w:t xml:space="preserve"> </w:t>
-      </w:r>
-      <w:proofErr w:type="spellStart"/>
-      <w:r>
-        <w:t>finibus</w:t>
-      </w:r>
-      <w:proofErr w:type="spellEnd"/>
-      <w:r>
-        <w:t xml:space="preserve"> </w:t>
-      </w:r>
-      <w:proofErr w:type="spellStart"/>
-      <w:r>
-        <w:t>eu</w:t>
-      </w:r>
-      <w:proofErr w:type="spellEnd"/>
-      <w:r>
-        <w:t xml:space="preserve"> sed ex. Sed </w:t>
-      </w:r>
-      <w:proofErr w:type="spellStart"/>
-      <w:r>
-        <w:t>molestie</w:t>
-      </w:r>
-      <w:proofErr w:type="spellEnd"/>
-      <w:r>
-        <w:t xml:space="preserve"> eros </w:t>
-      </w:r>
-      <w:proofErr w:type="spellStart"/>
-      <w:r>
-        <w:t>quam</w:t>
-      </w:r>
-      <w:proofErr w:type="spellEnd"/>
-      <w:r>
-        <w:t xml:space="preserve">, id </w:t>
-      </w:r>
-      <w:proofErr w:type="spellStart"/>
-      <w:r>
-        <w:t>ultricies</w:t>
-      </w:r>
-      <w:proofErr w:type="spellEnd"/>
-      <w:r>
-        <w:t xml:space="preserve"> libero maximus vitae. </w:t>
-      </w:r>
-      <w:proofErr w:type="spellStart"/>
-      <w:r>
-        <w:t>Fusce</w:t>
-      </w:r>
-      <w:proofErr w:type="spellEnd"/>
-      <w:r>
-        <w:t xml:space="preserve"> </w:t>
-      </w:r>
-      <w:proofErr w:type="spellStart"/>
-      <w:r>
-        <w:t>hendrerit</w:t>
-      </w:r>
-      <w:proofErr w:type="spellEnd"/>
-      <w:r>
-        <w:t xml:space="preserve"> </w:t>
-      </w:r>
-      <w:proofErr w:type="spellStart"/>
-      <w:r>
-        <w:t>orci</w:t>
-      </w:r>
-      <w:proofErr w:type="spellEnd"/>
-      <w:r>
-        <w:t xml:space="preserve"> sed </w:t>
-      </w:r>
-      <w:proofErr w:type="spellStart"/>
-      <w:r>
-        <w:t>tincidunt</w:t>
-      </w:r>
-      <w:proofErr w:type="spellEnd"/>
-      <w:r>
-        <w:t xml:space="preserve"> </w:t>
-      </w:r>
-      <w:proofErr w:type="spellStart"/>
-      <w:r>
-        <w:t>feugiat</w:t>
-      </w:r>
-      <w:proofErr w:type="spellEnd"/>
-      <w:r>
-        <w:t xml:space="preserve">. </w:t>
-      </w:r>
-      <w:proofErr w:type="spellStart"/>
-      <w:r>
-        <w:t>Fusce</w:t>
-      </w:r>
-      <w:proofErr w:type="spellEnd"/>
-      <w:r>
-        <w:t xml:space="preserve"> </w:t>
-      </w:r>
-      <w:proofErr w:type="spellStart"/>
-      <w:r>
-        <w:t>imperdiet</w:t>
-      </w:r>
-      <w:proofErr w:type="spellEnd"/>
-      <w:r>
-        <w:t xml:space="preserve"> </w:t>
-      </w:r>
-      <w:proofErr w:type="spellStart"/>
-      <w:r>
-        <w:t>pretium</w:t>
-      </w:r>
-      <w:proofErr w:type="spellEnd"/>
-      <w:r>
-        <w:t xml:space="preserve"> </w:t>
-      </w:r>
-      <w:proofErr w:type="spellStart"/>
-      <w:r>
-        <w:t>laoreet</w:t>
-      </w:r>
-      <w:proofErr w:type="spellEnd"/>
-      <w:r>
-        <w:t>.</w:t>
+        <w:t>In hac habitasse platea dictumst. Donec in convallis enim, id aliquam leo. Nam non justo a magna aliquet blandit at interdum nulla. Class aptent taciti sociosqu ad litora torquent per conubia nostra, per inceptos himenaeos. Donec condimentum non dolor quis suscipit. Nam ut sem ut neque efficitur finibus eu sed ex. Sed molestie eros quam, id ultricies libero maximus vitae. Fusce hendrerit orci sed tincidunt feugiat. Fusce imperdiet pretium laoreet.</w:t>
       </w:r>
     </w:p>
     <w:p>
@@ -1383,591 +506,12 @@
       </w:pPr>
       <w:r>
         <w:rPr>
-          <w:lang w:val="de-DE"/>
+          <w:lang w:val="en-US"/>
         </w:rPr>
-        <w:t xml:space="preserve">Nam </w:t>
-      </w:r>
-      <w:proofErr w:type="spellStart"/>
-      <w:r>
-        <w:rPr>
-          <w:lang w:val="de-DE"/>
-        </w:rPr>
-        <w:t>vel</w:t>
-      </w:r>
-      <w:proofErr w:type="spellEnd"/>
-      <w:r>
-        <w:rPr>
-          <w:lang w:val="de-DE"/>
-        </w:rPr>
-        <w:t xml:space="preserve"> </w:t>
-      </w:r>
-      <w:proofErr w:type="spellStart"/>
-      <w:r>
-        <w:rPr>
-          <w:lang w:val="de-DE"/>
-        </w:rPr>
-        <w:t>dignissim</w:t>
-      </w:r>
-      <w:proofErr w:type="spellEnd"/>
-      <w:r>
-        <w:rPr>
-          <w:lang w:val="de-DE"/>
-        </w:rPr>
-        <w:t xml:space="preserve"> </w:t>
-      </w:r>
-      <w:proofErr w:type="spellStart"/>
-      <w:r>
-        <w:rPr>
-          <w:lang w:val="de-DE"/>
-        </w:rPr>
-        <w:t>nisl</w:t>
-      </w:r>
-      <w:proofErr w:type="spellEnd"/>
-      <w:r>
-        <w:rPr>
-          <w:lang w:val="de-DE"/>
-        </w:rPr>
-        <w:t xml:space="preserve">. </w:t>
-      </w:r>
-      <w:proofErr w:type="spellStart"/>
-      <w:r>
-        <w:rPr>
-          <w:lang w:val="de-DE"/>
-        </w:rPr>
-        <w:t>Phasellus</w:t>
-      </w:r>
-      <w:proofErr w:type="spellEnd"/>
-      <w:r>
-        <w:rPr>
-          <w:lang w:val="de-DE"/>
-        </w:rPr>
-        <w:t xml:space="preserve"> </w:t>
-      </w:r>
-      <w:proofErr w:type="spellStart"/>
-      <w:r>
-        <w:rPr>
-          <w:lang w:val="de-DE"/>
-        </w:rPr>
-        <w:t>vel</w:t>
-      </w:r>
-      <w:proofErr w:type="spellEnd"/>
-      <w:r>
-        <w:rPr>
-          <w:lang w:val="de-DE"/>
-        </w:rPr>
-        <w:t xml:space="preserve"> </w:t>
-      </w:r>
-      <w:proofErr w:type="spellStart"/>
-      <w:r>
-        <w:rPr>
-          <w:lang w:val="de-DE"/>
-        </w:rPr>
-        <w:t>semper</w:t>
-      </w:r>
-      <w:proofErr w:type="spellEnd"/>
-      <w:r>
-        <w:rPr>
-          <w:lang w:val="de-DE"/>
-        </w:rPr>
-        <w:t xml:space="preserve"> </w:t>
-      </w:r>
-      <w:proofErr w:type="spellStart"/>
-      <w:r>
-        <w:rPr>
-          <w:lang w:val="de-DE"/>
-        </w:rPr>
-        <w:t>enim</w:t>
-      </w:r>
-      <w:proofErr w:type="spellEnd"/>
-      <w:r>
-        <w:rPr>
-          <w:lang w:val="de-DE"/>
-        </w:rPr>
-        <w:t xml:space="preserve">, </w:t>
-      </w:r>
-      <w:proofErr w:type="spellStart"/>
-      <w:r>
-        <w:rPr>
-          <w:lang w:val="de-DE"/>
-        </w:rPr>
-        <w:t>eget</w:t>
-      </w:r>
-      <w:proofErr w:type="spellEnd"/>
-      <w:r>
-        <w:rPr>
-          <w:lang w:val="de-DE"/>
-        </w:rPr>
-        <w:t xml:space="preserve"> </w:t>
-      </w:r>
-      <w:proofErr w:type="spellStart"/>
-      <w:r>
-        <w:rPr>
-          <w:lang w:val="de-DE"/>
-        </w:rPr>
-        <w:t>volutpat</w:t>
-      </w:r>
-      <w:proofErr w:type="spellEnd"/>
-      <w:r>
-        <w:rPr>
-          <w:lang w:val="de-DE"/>
-        </w:rPr>
-        <w:t xml:space="preserve"> quam. </w:t>
-      </w:r>
-      <w:proofErr w:type="spellStart"/>
-      <w:r>
-        <w:t>Suspendisse</w:t>
-      </w:r>
-      <w:proofErr w:type="spellEnd"/>
-      <w:r>
-        <w:t xml:space="preserve"> </w:t>
-      </w:r>
-      <w:proofErr w:type="spellStart"/>
-      <w:r>
-        <w:t>scelerisque</w:t>
-      </w:r>
-      <w:proofErr w:type="spellEnd"/>
-      <w:r>
-        <w:t xml:space="preserve">, </w:t>
-      </w:r>
-      <w:proofErr w:type="spellStart"/>
-      <w:r>
-        <w:t>erat</w:t>
-      </w:r>
-      <w:proofErr w:type="spellEnd"/>
-      <w:r>
-        <w:t xml:space="preserve"> sed </w:t>
-      </w:r>
-      <w:proofErr w:type="spellStart"/>
-      <w:r>
-        <w:t>suscipit</w:t>
-      </w:r>
-      <w:proofErr w:type="spellEnd"/>
-      <w:r>
-        <w:t xml:space="preserve"> </w:t>
-      </w:r>
-      <w:proofErr w:type="spellStart"/>
-      <w:r>
-        <w:t>venenatis</w:t>
-      </w:r>
-      <w:proofErr w:type="spellEnd"/>
-      <w:r>
-        <w:t xml:space="preserve">, </w:t>
-      </w:r>
-      <w:proofErr w:type="spellStart"/>
-      <w:r>
-        <w:t>lacus</w:t>
-      </w:r>
-      <w:proofErr w:type="spellEnd"/>
-      <w:r>
-        <w:t xml:space="preserve"> dolor </w:t>
-      </w:r>
-      <w:proofErr w:type="spellStart"/>
-      <w:r>
-        <w:t>volutpat</w:t>
-      </w:r>
-      <w:proofErr w:type="spellEnd"/>
-      <w:r>
-        <w:t xml:space="preserve"> </w:t>
-      </w:r>
-      <w:proofErr w:type="spellStart"/>
-      <w:r>
-        <w:t>augue</w:t>
-      </w:r>
-      <w:proofErr w:type="spellEnd"/>
-      <w:r>
-        <w:t xml:space="preserve">, ac </w:t>
-      </w:r>
-      <w:proofErr w:type="spellStart"/>
-      <w:r>
-        <w:t>suscipit</w:t>
-      </w:r>
-      <w:proofErr w:type="spellEnd"/>
-      <w:r>
-        <w:t xml:space="preserve"> </w:t>
-      </w:r>
-      <w:proofErr w:type="spellStart"/>
-      <w:r>
-        <w:t>elit</w:t>
-      </w:r>
-      <w:proofErr w:type="spellEnd"/>
-      <w:r>
-        <w:t xml:space="preserve"> </w:t>
-      </w:r>
-      <w:proofErr w:type="spellStart"/>
-      <w:r>
-        <w:t>urna</w:t>
-      </w:r>
-      <w:proofErr w:type="spellEnd"/>
-      <w:r>
-        <w:t xml:space="preserve"> non lorem. Donec fermentum </w:t>
-      </w:r>
-      <w:proofErr w:type="spellStart"/>
-      <w:r>
-        <w:t>rhoncus</w:t>
-      </w:r>
-      <w:proofErr w:type="spellEnd"/>
-      <w:r>
-        <w:t xml:space="preserve"> mi, sed porta </w:t>
-      </w:r>
-      <w:proofErr w:type="spellStart"/>
-      <w:r>
-        <w:t>metus</w:t>
-      </w:r>
-      <w:proofErr w:type="spellEnd"/>
-      <w:r>
-        <w:t xml:space="preserve"> </w:t>
-      </w:r>
-      <w:proofErr w:type="spellStart"/>
-      <w:r>
-        <w:t>congue</w:t>
-      </w:r>
-      <w:proofErr w:type="spellEnd"/>
-      <w:r>
-        <w:t xml:space="preserve"> sed. Sed fermentum </w:t>
-      </w:r>
-      <w:proofErr w:type="spellStart"/>
-      <w:r>
-        <w:t>lobortis</w:t>
-      </w:r>
-      <w:proofErr w:type="spellEnd"/>
-      <w:r>
-        <w:t xml:space="preserve"> </w:t>
-      </w:r>
-      <w:proofErr w:type="spellStart"/>
-      <w:r>
-        <w:t>augue</w:t>
-      </w:r>
-      <w:proofErr w:type="spellEnd"/>
-      <w:r>
-        <w:t xml:space="preserve"> vitae </w:t>
-      </w:r>
-      <w:proofErr w:type="spellStart"/>
-      <w:r>
-        <w:t>vehicula</w:t>
-      </w:r>
-      <w:proofErr w:type="spellEnd"/>
-      <w:r>
-        <w:t xml:space="preserve">. </w:t>
-      </w:r>
-      <w:proofErr w:type="spellStart"/>
-      <w:r>
-        <w:t>Pellentesque</w:t>
-      </w:r>
-      <w:proofErr w:type="spellEnd"/>
-      <w:r>
-        <w:t xml:space="preserve"> sit </w:t>
-      </w:r>
-      <w:proofErr w:type="spellStart"/>
-      <w:r>
-        <w:t>amet</w:t>
-      </w:r>
-      <w:proofErr w:type="spellEnd"/>
-      <w:r>
-        <w:t xml:space="preserve"> nunc vestibulum, </w:t>
-      </w:r>
-      <w:proofErr w:type="spellStart"/>
-      <w:r>
-        <w:t>aliquet</w:t>
-      </w:r>
-      <w:proofErr w:type="spellEnd"/>
-      <w:r>
-        <w:t xml:space="preserve"> </w:t>
-      </w:r>
-      <w:proofErr w:type="spellStart"/>
-      <w:r>
-        <w:t>lectus</w:t>
-      </w:r>
-      <w:proofErr w:type="spellEnd"/>
-      <w:r>
-        <w:t xml:space="preserve"> </w:t>
-      </w:r>
-      <w:proofErr w:type="spellStart"/>
-      <w:r>
-        <w:t>eu</w:t>
-      </w:r>
-      <w:proofErr w:type="spellEnd"/>
-      <w:r>
-        <w:t xml:space="preserve">, </w:t>
-      </w:r>
-      <w:proofErr w:type="spellStart"/>
-      <w:r>
-        <w:t>eleifend</w:t>
-      </w:r>
-      <w:proofErr w:type="spellEnd"/>
-      <w:r>
-        <w:t xml:space="preserve"> </w:t>
-      </w:r>
-      <w:proofErr w:type="spellStart"/>
-      <w:r>
-        <w:t>velit</w:t>
-      </w:r>
-      <w:proofErr w:type="spellEnd"/>
-      <w:r>
-        <w:t xml:space="preserve">. </w:t>
-      </w:r>
-      <w:proofErr w:type="spellStart"/>
-      <w:r>
-        <w:t>Curabitur</w:t>
-      </w:r>
-      <w:proofErr w:type="spellEnd"/>
-      <w:r>
-        <w:t xml:space="preserve"> </w:t>
-      </w:r>
-      <w:proofErr w:type="spellStart"/>
-      <w:r>
-        <w:t>laoreet</w:t>
-      </w:r>
-      <w:proofErr w:type="spellEnd"/>
-      <w:r>
-        <w:t xml:space="preserve"> </w:t>
-      </w:r>
-      <w:proofErr w:type="spellStart"/>
-      <w:r>
-        <w:t>viverra</w:t>
-      </w:r>
-      <w:proofErr w:type="spellEnd"/>
-      <w:r>
-        <w:t xml:space="preserve"> dui id </w:t>
-      </w:r>
-      <w:proofErr w:type="spellStart"/>
-      <w:r>
-        <w:t>iaculis</w:t>
-      </w:r>
-      <w:proofErr w:type="spellEnd"/>
-      <w:r>
-        <w:t xml:space="preserve">. Nam libero </w:t>
-      </w:r>
-      <w:proofErr w:type="spellStart"/>
-      <w:r>
-        <w:t>sem</w:t>
-      </w:r>
-      <w:proofErr w:type="spellEnd"/>
-      <w:r>
-        <w:t xml:space="preserve">, </w:t>
-      </w:r>
-      <w:proofErr w:type="spellStart"/>
-      <w:r>
-        <w:t>egestas</w:t>
-      </w:r>
-      <w:proofErr w:type="spellEnd"/>
-      <w:r>
-        <w:t xml:space="preserve"> in </w:t>
-      </w:r>
-      <w:proofErr w:type="spellStart"/>
-      <w:r>
-        <w:t>pellentesque</w:t>
-      </w:r>
-      <w:proofErr w:type="spellEnd"/>
-      <w:r>
-        <w:t xml:space="preserve"> et, </w:t>
-      </w:r>
-      <w:proofErr w:type="spellStart"/>
-      <w:r>
-        <w:t>placerat</w:t>
-      </w:r>
-      <w:proofErr w:type="spellEnd"/>
-      <w:r>
-        <w:t xml:space="preserve"> ac </w:t>
-      </w:r>
-      <w:proofErr w:type="spellStart"/>
-      <w:r>
-        <w:t>lectus</w:t>
-      </w:r>
-      <w:proofErr w:type="spellEnd"/>
-      <w:r>
-        <w:t xml:space="preserve">. Vestibulum </w:t>
-      </w:r>
-      <w:proofErr w:type="spellStart"/>
-      <w:r>
-        <w:t>scelerisque</w:t>
-      </w:r>
-      <w:proofErr w:type="spellEnd"/>
-      <w:r>
-        <w:t xml:space="preserve"> </w:t>
-      </w:r>
-      <w:proofErr w:type="spellStart"/>
-      <w:r>
-        <w:t>sapien</w:t>
-      </w:r>
-      <w:proofErr w:type="spellEnd"/>
-      <w:r>
-        <w:t xml:space="preserve"> at </w:t>
-      </w:r>
-      <w:proofErr w:type="spellStart"/>
-      <w:r>
-        <w:t>augue</w:t>
-      </w:r>
-      <w:proofErr w:type="spellEnd"/>
-      <w:r>
-        <w:t xml:space="preserve"> </w:t>
-      </w:r>
-      <w:proofErr w:type="spellStart"/>
-      <w:r>
-        <w:t>viverra</w:t>
-      </w:r>
-      <w:proofErr w:type="spellEnd"/>
-      <w:r>
-        <w:t xml:space="preserve"> </w:t>
-      </w:r>
-      <w:proofErr w:type="spellStart"/>
-      <w:r>
-        <w:t>elementum</w:t>
-      </w:r>
-      <w:proofErr w:type="spellEnd"/>
-      <w:r>
-        <w:t xml:space="preserve">. </w:t>
-      </w:r>
-      <w:proofErr w:type="spellStart"/>
-      <w:r>
-        <w:t>Praesent</w:t>
-      </w:r>
-      <w:proofErr w:type="spellEnd"/>
-      <w:r>
-        <w:t xml:space="preserve"> </w:t>
-      </w:r>
-      <w:proofErr w:type="spellStart"/>
-      <w:r>
-        <w:t>volutpat</w:t>
-      </w:r>
-      <w:proofErr w:type="spellEnd"/>
-      <w:r>
-        <w:t xml:space="preserve"> </w:t>
-      </w:r>
-      <w:proofErr w:type="spellStart"/>
-      <w:r>
-        <w:t>nulla</w:t>
-      </w:r>
-      <w:proofErr w:type="spellEnd"/>
-      <w:r>
-        <w:t xml:space="preserve"> ac </w:t>
-      </w:r>
-      <w:proofErr w:type="spellStart"/>
-      <w:r>
-        <w:t>fringilla</w:t>
-      </w:r>
-      <w:proofErr w:type="spellEnd"/>
-      <w:r>
-        <w:t xml:space="preserve"> </w:t>
-      </w:r>
-      <w:proofErr w:type="spellStart"/>
-      <w:r>
-        <w:t>tincidunt</w:t>
-      </w:r>
-      <w:proofErr w:type="spellEnd"/>
-      <w:r>
-        <w:t xml:space="preserve">. Sed </w:t>
-      </w:r>
-      <w:proofErr w:type="spellStart"/>
-      <w:r>
-        <w:t>quis</w:t>
-      </w:r>
-      <w:proofErr w:type="spellEnd"/>
-      <w:r>
-        <w:t xml:space="preserve"> </w:t>
-      </w:r>
-      <w:proofErr w:type="spellStart"/>
-      <w:r>
-        <w:t>congue</w:t>
-      </w:r>
-      <w:proofErr w:type="spellEnd"/>
-      <w:r>
-        <w:t xml:space="preserve"> </w:t>
-      </w:r>
-      <w:proofErr w:type="spellStart"/>
-      <w:r>
-        <w:t>urna</w:t>
-      </w:r>
-      <w:proofErr w:type="spellEnd"/>
-      <w:r>
-        <w:t xml:space="preserve">, nec </w:t>
-      </w:r>
-      <w:proofErr w:type="spellStart"/>
-      <w:r>
-        <w:t>dapibus</w:t>
-      </w:r>
-      <w:proofErr w:type="spellEnd"/>
-      <w:r>
-        <w:t xml:space="preserve"> </w:t>
-      </w:r>
-      <w:proofErr w:type="spellStart"/>
-      <w:r>
-        <w:t>felis</w:t>
-      </w:r>
-      <w:proofErr w:type="spellEnd"/>
-      <w:r>
-        <w:t xml:space="preserve">. </w:t>
-      </w:r>
-      <w:proofErr w:type="spellStart"/>
-      <w:r>
-        <w:t>Praesent</w:t>
-      </w:r>
-      <w:proofErr w:type="spellEnd"/>
-      <w:r>
-        <w:t xml:space="preserve"> pharetra in </w:t>
-      </w:r>
-      <w:proofErr w:type="spellStart"/>
-      <w:r>
-        <w:t>erat</w:t>
-      </w:r>
-      <w:proofErr w:type="spellEnd"/>
-      <w:r>
-        <w:t xml:space="preserve"> </w:t>
-      </w:r>
-      <w:proofErr w:type="spellStart"/>
-      <w:r>
-        <w:t>euismod</w:t>
-      </w:r>
-      <w:proofErr w:type="spellEnd"/>
-      <w:r>
-        <w:t xml:space="preserve"> </w:t>
-      </w:r>
-      <w:proofErr w:type="spellStart"/>
-      <w:r>
-        <w:t>sollicitudin</w:t>
-      </w:r>
-      <w:proofErr w:type="spellEnd"/>
-      <w:r>
-        <w:t xml:space="preserve">. </w:t>
-      </w:r>
-      <w:proofErr w:type="spellStart"/>
-      <w:r>
-        <w:t>Quisque</w:t>
-      </w:r>
-      <w:proofErr w:type="spellEnd"/>
-      <w:r>
-        <w:t xml:space="preserve"> </w:t>
-      </w:r>
-      <w:proofErr w:type="spellStart"/>
-      <w:r>
-        <w:t>efficitur</w:t>
-      </w:r>
-      <w:proofErr w:type="spellEnd"/>
-      <w:r>
-        <w:t xml:space="preserve"> diam libero, nec </w:t>
-      </w:r>
-      <w:proofErr w:type="spellStart"/>
-      <w:r>
-        <w:t>volutpat</w:t>
-      </w:r>
-      <w:proofErr w:type="spellEnd"/>
-      <w:r>
-        <w:t xml:space="preserve"> </w:t>
-      </w:r>
-      <w:proofErr w:type="spellStart"/>
-      <w:r>
-        <w:t>enim</w:t>
-      </w:r>
-      <w:proofErr w:type="spellEnd"/>
-      <w:r>
-        <w:t xml:space="preserve"> </w:t>
-      </w:r>
-      <w:proofErr w:type="spellStart"/>
-      <w:r>
-        <w:t>laoreet</w:t>
-      </w:r>
-      <w:proofErr w:type="spellEnd"/>
-      <w:r>
-        <w:t xml:space="preserve"> in.</w:t>
+        <w:t xml:space="preserve">Nam vel dignissim nisl. Phasellus vel semper enim, eget volutpat quam. </w:t>
+      </w:r>
+      <w:r>
+        <w:t>Suspendisse scelerisque, erat sed suscipit venenatis, lacus dolor volutpat augue, ac suscipit elit urna non lorem. Donec fermentum rhoncus mi, sed porta metus congue sed. Sed fermentum lobortis augue vitae vehicula. Pellentesque sit amet nunc vestibulum, aliquet lectus eu, eleifend velit. Curabitur laoreet viverra dui id iaculis. Nam libero sem, egestas in pellentesque et, placerat ac lectus. Vestibulum scelerisque sapien at augue viverra elementum. Praesent volutpat nulla ac fringilla tincidunt. Sed quis congue urna, nec dapibus felis. Praesent pharetra in erat euismod sollicitudin. Quisque efficitur diam libero, nec volutpat enim laoreet in.</w:t>
       </w:r>
     </w:p>
     <w:p>
@@ -2000,15 +544,7 @@
         <w:pStyle w:val="FirstParagraph"/>
       </w:pPr>
       <w:r>
-        <w:t>We have found the following reference datasets that we have considered for re-</w:t>
-      </w:r>
-      <w:proofErr w:type="gramStart"/>
-      <w:r>
-        <w:t>use</w:t>
-      </w:r>
-      <w:proofErr w:type="gramEnd"/>
-      <w:r>
-        <w:t>:</w:t>
+        <w:t>We have found the following reference datasets that we have considered for re-use:</w:t>
       </w:r>
     </w:p>
     <w:p>
@@ -2034,23 +570,7 @@
         </w:numPr>
       </w:pPr>
       <w:r>
-        <w:t xml:space="preserve">We decided not </w:t>
-      </w:r>
-      <w:proofErr w:type="gramStart"/>
-      <w:r>
-        <w:t>use</w:t>
-      </w:r>
-      <w:proofErr w:type="gramEnd"/>
-      <w:r>
-        <w:t xml:space="preserve"> this reference dataset because it </w:t>
-      </w:r>
-      <w:proofErr w:type="gramStart"/>
-      <w:r>
-        <w:t>misses</w:t>
-      </w:r>
-      <w:proofErr w:type="gramEnd"/>
-      <w:r>
-        <w:t xml:space="preserve"> required aspects.</w:t>
+        <w:t>We decided not use this reference dataset because it misses required aspects.</w:t>
       </w:r>
     </w:p>
     <w:p>
@@ -2164,15 +684,7 @@
         <w:pStyle w:val="Zkladntext"/>
       </w:pPr>
       <w:r>
-        <w:t xml:space="preserve">Albert Einstein is responsible for implementing the </w:t>
-      </w:r>
-      <w:proofErr w:type="gramStart"/>
-      <w:r>
-        <w:t>DMP, and</w:t>
-      </w:r>
-      <w:proofErr w:type="gramEnd"/>
-      <w:r>
-        <w:t xml:space="preserve"> ensuring it is reviewed and revised.</w:t>
+        <w:t>Albert Einstein is responsible for implementing the DMP, and ensuring it is reviewed and revised.</w:t>
       </w:r>
     </w:p>
     <w:p>
@@ -2180,15 +692,7 @@
         <w:pStyle w:val="Zkladntext"/>
       </w:pPr>
       <w:r>
-        <w:t xml:space="preserve">To execute the DMP, additional specialist expertise is </w:t>
-      </w:r>
-      <w:proofErr w:type="gramStart"/>
-      <w:r>
-        <w:t>required</w:t>
-      </w:r>
-      <w:proofErr w:type="gramEnd"/>
-      <w:r>
-        <w:t xml:space="preserve"> and we have such trained support staff available.</w:t>
+        <w:t>To execute the DMP, additional specialist expertise is required and we have such trained support staff available.</w:t>
       </w:r>
     </w:p>
     <w:p>
@@ -2270,15 +774,7 @@
         <w:t>Common DSW Knowledge Model</w:t>
       </w:r>
       <w:r>
-        <w:t xml:space="preserve"> (ID: </w:t>
-      </w:r>
-      <w:proofErr w:type="gramStart"/>
-      <w:r>
-        <w:t>dsw:root</w:t>
-      </w:r>
-      <w:proofErr w:type="gramEnd"/>
-      <w:r>
-        <w:t xml:space="preserve">:2.3.14) knowledge model to make our DMP. More specifically, we use the </w:t>
+        <w:t xml:space="preserve"> (ID: dsw:root:2.3.14) knowledge model to make our DMP. More specifically, we use the </w:t>
       </w:r>
       <w:hyperlink r:id="rId12">
         <w:r>
@@ -2538,6 +1034,9 @@
       <w:pStyle w:val="Zhlav"/>
       <w:tabs>
         <w:tab w:val="clear" w:pos="9072"/>
+        <w:tab w:val="left" w:pos="5370"/>
+        <w:tab w:val="left" w:pos="5940"/>
+        <w:tab w:val="left" w:pos="7020"/>
         <w:tab w:val="right" w:pos="9356"/>
       </w:tabs>
     </w:pPr>
@@ -2546,10 +1045,10 @@
         <w:noProof/>
       </w:rPr>
       <w:drawing>
-        <wp:inline distT="0" distB="0" distL="0" distR="0" wp14:anchorId="0489AA04" wp14:editId="2294502C">
-          <wp:extent cx="2743200" cy="385354"/>
+        <wp:inline distT="0" distB="0" distL="0" distR="0" wp14:anchorId="350EDF1A" wp14:editId="3E053623">
+          <wp:extent cx="2990850" cy="391187"/>
           <wp:effectExtent l="0" t="0" r="0" b="0"/>
-          <wp:docPr id="674343168" name="Grafický objekt 1"/>
+          <wp:docPr id="1515171012" name="Obrázek 2"/>
           <wp:cNvGraphicFramePr>
             <a:graphicFrameLocks xmlns:a="http://schemas.openxmlformats.org/drawingml/2006/main" noChangeAspect="1"/>
           </wp:cNvGraphicFramePr>
@@ -2557,29 +1056,36 @@
             <a:graphicData uri="http://schemas.openxmlformats.org/drawingml/2006/picture">
               <pic:pic xmlns:pic="http://schemas.openxmlformats.org/drawingml/2006/picture">
                 <pic:nvPicPr>
-                  <pic:cNvPr id="282209537" name="Grafický objekt 282209537"/>
-                  <pic:cNvPicPr/>
+                  <pic:cNvPr id="0" name="Picture 2"/>
+                  <pic:cNvPicPr>
+                    <a:picLocks noChangeAspect="1" noChangeArrowheads="1"/>
+                  </pic:cNvPicPr>
                 </pic:nvPicPr>
                 <pic:blipFill>
                   <a:blip r:embed="rId1">
                     <a:extLst>
-                      <a:ext uri="{96DAC541-7B7A-43D3-8B79-37D633B846F1}">
-                        <asvg:svgBlip xmlns:asvg="http://schemas.microsoft.com/office/drawing/2016/SVG/main" r:embed="rId2"/>
+                      <a:ext uri="{28A0092B-C50C-407E-A947-70E740481C1C}">
+                        <a14:useLocalDpi xmlns:a14="http://schemas.microsoft.com/office/drawing/2010/main" val="0"/>
                       </a:ext>
                     </a:extLst>
                   </a:blip>
+                  <a:srcRect/>
                   <a:stretch>
                     <a:fillRect/>
                   </a:stretch>
                 </pic:blipFill>
-                <pic:spPr>
+                <pic:spPr bwMode="auto">
                   <a:xfrm>
                     <a:off x="0" y="0"/>
-                    <a:ext cx="2884512" cy="405205"/>
+                    <a:ext cx="2990850" cy="391187"/>
                   </a:xfrm>
                   <a:prstGeom prst="rect">
                     <a:avLst/>
                   </a:prstGeom>
+                  <a:noFill/>
+                  <a:ln>
+                    <a:noFill/>
+                  </a:ln>
                 </pic:spPr>
               </pic:pic>
             </a:graphicData>
@@ -2588,10 +1094,7 @@
       </w:drawing>
     </w:r>
     <w:r>
-      <w:tab/>
-    </w:r>
-    <w:r>
-      <w:tab/>
+      <w:ptab w:relativeTo="margin" w:alignment="right" w:leader="none"/>
     </w:r>
     <w:sdt>
       <w:sdtPr>
@@ -2628,21 +1131,15 @@
       <w:pStyle w:val="Zhlav"/>
       <w:jc w:val="center"/>
     </w:pPr>
-  </w:p>
-  <w:p>
-    <w:pPr>
-      <w:pStyle w:val="Zhlav"/>
-      <w:jc w:val="center"/>
-    </w:pPr>
     <w:r>
       <w:rPr>
         <w:noProof/>
       </w:rPr>
       <w:drawing>
-        <wp:inline distT="0" distB="0" distL="0" distR="0" wp14:anchorId="04B272AD" wp14:editId="3168D557">
-          <wp:extent cx="5334000" cy="749300"/>
+        <wp:inline distT="0" distB="0" distL="0" distR="0" wp14:anchorId="45F42BC4" wp14:editId="2094E275">
+          <wp:extent cx="5753100" cy="752475"/>
           <wp:effectExtent l="0" t="0" r="0" b="0"/>
-          <wp:docPr id="282209537" name="Grafický objekt 1"/>
+          <wp:docPr id="1898399591" name="Obrázek 1"/>
           <wp:cNvGraphicFramePr>
             <a:graphicFrameLocks xmlns:a="http://schemas.openxmlformats.org/drawingml/2006/main" noChangeAspect="1"/>
           </wp:cNvGraphicFramePr>
@@ -2650,29 +1147,36 @@
             <a:graphicData uri="http://schemas.openxmlformats.org/drawingml/2006/picture">
               <pic:pic xmlns:pic="http://schemas.openxmlformats.org/drawingml/2006/picture">
                 <pic:nvPicPr>
-                  <pic:cNvPr id="282209537" name="Grafický objekt 282209537"/>
-                  <pic:cNvPicPr/>
+                  <pic:cNvPr id="0" name="Picture 1"/>
+                  <pic:cNvPicPr>
+                    <a:picLocks noChangeAspect="1" noChangeArrowheads="1"/>
+                  </pic:cNvPicPr>
                 </pic:nvPicPr>
                 <pic:blipFill>
                   <a:blip r:embed="rId1">
                     <a:extLst>
-                      <a:ext uri="{96DAC541-7B7A-43D3-8B79-37D633B846F1}">
-                        <asvg:svgBlip xmlns:asvg="http://schemas.microsoft.com/office/drawing/2016/SVG/main" r:embed="rId2"/>
+                      <a:ext uri="{28A0092B-C50C-407E-A947-70E740481C1C}">
+                        <a14:useLocalDpi xmlns:a14="http://schemas.microsoft.com/office/drawing/2010/main" val="0"/>
                       </a:ext>
                     </a:extLst>
                   </a:blip>
+                  <a:srcRect/>
                   <a:stretch>
                     <a:fillRect/>
                   </a:stretch>
                 </pic:blipFill>
-                <pic:spPr>
+                <pic:spPr bwMode="auto">
                   <a:xfrm>
                     <a:off x="0" y="0"/>
-                    <a:ext cx="5334000" cy="749300"/>
+                    <a:ext cx="5753100" cy="752475"/>
                   </a:xfrm>
                   <a:prstGeom prst="rect">
                     <a:avLst/>
                   </a:prstGeom>
+                  <a:noFill/>
+                  <a:ln>
+                    <a:noFill/>
+                  </a:ln>
                 </pic:spPr>
               </pic:pic>
             </a:graphicData>

</xml_diff>